<commit_message>
Quartz sync: 2024-10-28 12:29:46
</commit_message>
<xml_diff>
--- a/content/Organised/University of Lincoln/Bachelor of Science with Honours in Mathematics/Year 2/Algebraic Structures/Coursework/Algebraic Structures Coursework.docx
+++ b/content/Organised/University of Lincoln/Bachelor of Science with Honours in Mathematics/Year 2/Algebraic Structures/Coursework/Algebraic Structures Coursework.docx
@@ -3944,6 +3944,12 @@
                         </m:r>
                       </m:e>
                     </m:d>
+                    <m:r>
+                      <m:rPr>
+                        <m:nor/>
+                      </m:rPr>
+                      <m:t xml:space="preserve"> by associativity</m:t>
+                    </m:r>
                   </m:e>
                 </m:mr>
                 <m:mr>
@@ -6524,6 +6530,11 @@
                     </m:r>
                   </m:sub>
                 </m:sSub>
+              </m:e>
+            </m:mr>
+            <m:mr>
+              <m:e/>
+              <m:e>
                 <m:r>
                   <m:rPr>
                     <m:sty m:val="p"/>
@@ -6532,6 +6543,12 @@
                     <w:rFonts w:ascii="Cambria Math" w:hAnsi="Cambria Math"/>
                   </w:rPr>
                   <m:t>∴</m:t>
+                </m:r>
+                <m:r>
+                  <m:rPr>
+                    <m:nor/>
+                  </m:rPr>
+                  <m:t xml:space="preserve">only commutative if </m:t>
                 </m:r>
                 <m:r>
                   <w:rPr>
@@ -6553,6 +6570,12 @@
                     <w:rFonts w:ascii="Cambria Math" w:hAnsi="Cambria Math"/>
                   </w:rPr>
                   <m:t>B</m:t>
+                </m:r>
+                <m:r>
+                  <m:rPr>
+                    <m:nor/>
+                  </m:rPr>
+                  <m:t>, hence not generally abelian.</m:t>
                 </m:r>
               </m:e>
             </m:mr>
@@ -8021,7 +8044,6 @@
         <w:pStyle w:val="FirstParagraph"/>
       </w:pPr>
       <w:r>
-        <w:lastRenderedPageBreak/>
         <w:t xml:space="preserve">Whilst </w:t>
       </w:r>
       <m:oMath>
@@ -9705,6 +9727,74 @@
                     </m:r>
                   </m:e>
                 </m:d>
+                <m:r>
+                  <m:rPr>
+                    <m:sty m:val="p"/>
+                  </m:rPr>
+                  <w:rPr>
+                    <w:rFonts w:ascii="Cambria Math" w:hAnsi="Cambria Math"/>
+                  </w:rPr>
+                  <m:t>:</m:t>
+                </m:r>
+                <m:r>
+                  <w:rPr>
+                    <w:rFonts w:ascii="Cambria Math" w:hAnsi="Cambria Math"/>
+                  </w:rPr>
+                  <m:t>a</m:t>
+                </m:r>
+                <m:r>
+                  <m:rPr>
+                    <m:sty m:val="p"/>
+                  </m:rPr>
+                  <w:rPr>
+                    <w:rFonts w:ascii="Cambria Math" w:hAnsi="Cambria Math"/>
+                  </w:rPr>
+                  <m:t>,</m:t>
+                </m:r>
+                <m:r>
+                  <w:rPr>
+                    <w:rFonts w:ascii="Cambria Math" w:hAnsi="Cambria Math"/>
+                  </w:rPr>
+                  <m:t>b</m:t>
+                </m:r>
+                <m:r>
+                  <m:rPr>
+                    <m:sty m:val="p"/>
+                  </m:rPr>
+                  <w:rPr>
+                    <w:rFonts w:ascii="Cambria Math" w:hAnsi="Cambria Math"/>
+                  </w:rPr>
+                  <m:t>∈</m:t>
+                </m:r>
+                <m:sSub>
+                  <m:sSubPr>
+                    <m:ctrlPr>
+                      <w:rPr>
+                        <w:rFonts w:ascii="Cambria Math" w:hAnsi="Cambria Math"/>
+                      </w:rPr>
+                    </m:ctrlPr>
+                  </m:sSubPr>
+                  <m:e>
+                    <m:r>
+                      <m:rPr>
+                        <m:scr m:val="double-struck"/>
+                        <m:sty m:val="p"/>
+                      </m:rPr>
+                      <w:rPr>
+                        <w:rFonts w:ascii="Cambria Math" w:hAnsi="Cambria Math"/>
+                      </w:rPr>
+                      <m:t>Z</m:t>
+                    </m:r>
+                  </m:e>
+                  <m:sub>
+                    <m:r>
+                      <w:rPr>
+                        <w:rFonts w:ascii="Cambria Math" w:hAnsi="Cambria Math"/>
+                      </w:rPr>
+                      <m:t>12</m:t>
+                    </m:r>
+                  </m:sub>
+                </m:sSub>
               </m:e>
             </m:mr>
             <m:mr>
@@ -10486,7 +10576,7 @@
   <w:abstractNum w:abstractNumId="0" w15:restartNumberingAfterBreak="0">
     <w:nsid w:val="0000A990"/>
     <w:multiLevelType w:val="multilevel"/>
-    <w:tmpl w:val="D8C807EC"/>
+    <w:tmpl w:val="F35A5C3E"/>
     <w:lvl w:ilvl="0">
       <w:numFmt w:val="bullet"/>
       <w:lvlText w:val=" "/>
@@ -10667,7 +10757,7 @@
   <w:num w:numId="1" w16cid:durableId="1626231186">
     <w:abstractNumId w:val="1"/>
   </w:num>
-  <w:num w:numId="2" w16cid:durableId="55403350">
+  <w:num w:numId="2" w16cid:durableId="38208573">
     <w:abstractNumId w:val="0"/>
   </w:num>
 </w:numbering>
@@ -11256,7 +11346,6 @@
   <w:style w:type="character" w:default="1" w:styleId="DefaultParagraphFont">
     <w:name w:val="Default Paragraph Font"/>
     <w:uiPriority w:val="1"/>
-    <w:semiHidden/>
     <w:unhideWhenUsed/>
   </w:style>
   <w:style w:type="table" w:default="1" w:styleId="TableNormal">
@@ -12266,7 +12355,7 @@
     <w:basedOn w:val="Normal"/>
     <w:link w:val="HeaderChar"/>
     <w:unhideWhenUsed/>
-    <w:rsid w:val="0003649D"/>
+    <w:rsid w:val="0032334A"/>
     <w:pPr>
       <w:tabs>
         <w:tab w:val="center" w:pos="4513"/>
@@ -12279,14 +12368,14 @@
     <w:name w:val="Header Char"/>
     <w:basedOn w:val="DefaultParagraphFont"/>
     <w:link w:val="Header"/>
-    <w:rsid w:val="0003649D"/>
+    <w:rsid w:val="0032334A"/>
   </w:style>
   <w:style w:type="paragraph" w:styleId="Footer">
     <w:name w:val="footer"/>
     <w:basedOn w:val="Normal"/>
     <w:link w:val="FooterChar"/>
     <w:unhideWhenUsed/>
-    <w:rsid w:val="0003649D"/>
+    <w:rsid w:val="0032334A"/>
     <w:pPr>
       <w:tabs>
         <w:tab w:val="center" w:pos="4513"/>
@@ -12299,7 +12388,7 @@
     <w:name w:val="Footer Char"/>
     <w:basedOn w:val="DefaultParagraphFont"/>
     <w:link w:val="Footer"/>
-    <w:rsid w:val="0003649D"/>
+    <w:rsid w:val="0032334A"/>
   </w:style>
 </w:styles>
 </file>

</xml_diff>